<commit_message>
docs: completar carta con datos del evento (Cumbre, Chile)
- Nombre del evento: Cumbre de los Millonarios Conscientes
- Ciudad de emision: Santiago de Chile
- Proyeccion explicita para la edicion 2027 y mencion a replicar en
  Chile la curva de crecimiento de Argentina (3.000 -> 6.000)
- Tabla de campos pendientes actualizada

Co-Authored-By: Claude Opus 5 <noreply@anthropic.com>
Claude-Session: https://claude.ai/code/session_017pezomCG814h6haRSx8NRv
</commit_message>
<xml_diff>
--- a/docs/cartas/carta-cambio-de-sala.docx
+++ b/docs/cartas/carta-cambio-de-sala.docx
@@ -50,7 +50,7 @@
           <w:sz w:val="22"/>
           <w:szCs w:val="22"/>
         </w:rPr>
-        <w:t xml:space="preserve">[Ciudad], [día] de [mes] de [año]</w:t>
+        <w:t xml:space="preserve">Santiago de Chile, [día] de [mes] de [año]</w:t>
       </w:r>
     </w:p>
     <w:p>
@@ -140,7 +140,7 @@
           <w:sz w:val="22"/>
           <w:szCs w:val="22"/>
         </w:rPr>
-        <w:t xml:space="preserve">Solicitud formal de cambio de sala — de Sala Expo Center (4.600 m²) a Gran Salón (1.600 m²) — [Nombre del evento], [fecha del evento].</w:t>
+        <w:t xml:space="preserve">Solicitud formal de cambio de sala — de Sala Expo Center (4.600 m²) a Gran Salón (1.600 m²) — Cumbre de los Millonarios Conscientes, [fecha del evento].</w:t>
       </w:r>
     </w:p>
     <w:p>
@@ -170,7 +170,7 @@
           <w:sz w:val="22"/>
           <w:szCs w:val="22"/>
         </w:rPr>
-        <w:t xml:space="preserve">Por medio de la presente, y en representación de Aura Productions, productora responsable de [Nombre del evento] a realizarse el [fecha] en sus instalaciones, nos dirigimos a ustedes con el objeto de solicitar formalmente el cambio de la sala oportunamente reservada, pasando de la Sala Expo Center (4.600 m²) al Gran Salón (1.600 m²).</w:t>
+        <w:t xml:space="preserve">Por medio de la presente, y en representación de Aura Productions, productora responsable de la Cumbre de los Millonarios Conscientes, a realizarse el [fecha del evento] en sus instalaciones, nos dirigimos a ustedes con el objeto de solicitar formalmente el cambio de la sala oportunamente reservada, pasando de la Sala Expo Center (4.600 m²) al Gran Salón (1.600 m²).</w:t>
       </w:r>
     </w:p>
     <w:p>
@@ -335,7 +335,7 @@
           <w:sz w:val="22"/>
           <w:szCs w:val="22"/>
         </w:rPr>
-        <w:t xml:space="preserve">Queremos ser transparentes respecto de nuestra visión: Aura Productions trabaja con un plan de escalamiento anual sostenido. En Argentina pasamos de 3.000 asistentes el año pasado a un aforo de 6.000 personas en la edición de este año. Bajo esa misma lógica, nuestra proyección para [año próximo] es de entre 3.000 y 4.000 asistentes, volumen para el cual la Sala Expo Center resulta el espacio natural y al que aspiramos a llegar de la mano de ustedes.</w:t>
+        <w:t xml:space="preserve">Queremos ser transparentes respecto de nuestra visión: la Cumbre de los Millonarios Conscientes es un proyecto con un plan de escalamiento anual sostenido. En Argentina pasamos de 3.000 asistentes el año pasado a un aforo de 6.000 personas en la edición de este año, y nuestro objetivo es replicar esa misma curva de crecimiento en Chile. Bajo esa lógica, nuestra proyección para la edición 2027 es de entre 3.000 y 4.000 asistentes, volumen para el cual la Sala Expo Center resulta el espacio natural y al que aspiramos a llegar de la mano de ustedes.</w:t>
       </w:r>
     </w:p>
     <w:p>
@@ -350,7 +350,7 @@
           <w:sz w:val="22"/>
           <w:szCs w:val="22"/>
         </w:rPr>
-        <w:t xml:space="preserve">En otras palabras, no buscamos reducir nuestra presencia en el predio, sino ordenarla en el tiempo: la sala adecuada este año y el Expo Center el año próximo. Para que ese crecimiento sea posible, necesitamos que esta edición sea rentable.</w:t>
+        <w:t xml:space="preserve">En otras palabras, no buscamos reducir nuestra presencia en el predio, sino ordenarla en el tiempo: la sala adecuada este año y el Expo Center en 2027. Para que ese crecimiento sea posible, necesitamos que esta edición sea rentable.</w:t>
       </w:r>
     </w:p>
     <w:p>

</xml_diff>

<commit_message>
docs: completar carta con destinatario y fechas definitivas
- Destinatario: Departamento Comercial, Espacio Riesco (Santiago de Chile)
- Fechas del evento: 12 y 13 de septiembre de 2026
- Fecha de emision: 4 de septiembre de 2026
- Parrafo de cierre reformulado para pedir confirmacion inmediata,
  dada la proximidad de la fecha del evento
- Solo resta completar el bloque de firma

Co-Authored-By: Claude Opus 5 <noreply@anthropic.com>
Claude-Session: https://claude.ai/code/session_017pezomCG814h6haRSx8NRv
</commit_message>
<xml_diff>
--- a/docs/cartas/carta-cambio-de-sala.docx
+++ b/docs/cartas/carta-cambio-de-sala.docx
@@ -50,7 +50,7 @@
           <w:sz w:val="22"/>
           <w:szCs w:val="22"/>
         </w:rPr>
-        <w:t xml:space="preserve">Santiago de Chile, [día] de [mes] de [año]</w:t>
+        <w:t xml:space="preserve">Santiago de Chile, 4 de septiembre de 2026</w:t>
       </w:r>
     </w:p>
     <w:p>
@@ -61,13 +61,11 @@
       <w:r>
         <w:rPr>
           <w:rFonts w:ascii="Calibri" w:cs="Calibri" w:eastAsia="Calibri" w:hAnsi="Calibri"/>
-          <w:b/>
-          <w:bCs/>
-          <w:color w:val="1A1A1A"/>
-          <w:sz w:val="22"/>
-          <w:szCs w:val="22"/>
-        </w:rPr>
-        <w:t xml:space="preserve">Sr./Sra. [Nombre y apellido]</w:t>
+          <w:color w:val="1A1A1A"/>
+          <w:sz w:val="22"/>
+          <w:szCs w:val="22"/>
+        </w:rPr>
+        <w:t xml:space="preserve">Sres.</w:t>
       </w:r>
     </w:p>
     <w:p>
@@ -78,11 +76,13 @@
       <w:r>
         <w:rPr>
           <w:rFonts w:ascii="Calibri" w:cs="Calibri" w:eastAsia="Calibri" w:hAnsi="Calibri"/>
-          <w:color w:val="1A1A1A"/>
-          <w:sz w:val="22"/>
-          <w:szCs w:val="22"/>
-        </w:rPr>
-        <w:t xml:space="preserve">[Cargo]</w:t>
+          <w:b/>
+          <w:bCs/>
+          <w:color w:val="1A1A1A"/>
+          <w:sz w:val="22"/>
+          <w:szCs w:val="22"/>
+        </w:rPr>
+        <w:t xml:space="preserve">Departamento Comercial</w:t>
       </w:r>
     </w:p>
     <w:p>
@@ -93,11 +93,13 @@
       <w:r>
         <w:rPr>
           <w:rFonts w:ascii="Calibri" w:cs="Calibri" w:eastAsia="Calibri" w:hAnsi="Calibri"/>
-          <w:color w:val="1A1A1A"/>
-          <w:sz w:val="22"/>
-          <w:szCs w:val="22"/>
-        </w:rPr>
-        <w:t xml:space="preserve">[Nombre del predio / Centro de Convenciones]</w:t>
+          <w:b/>
+          <w:bCs/>
+          <w:color w:val="1A1A1A"/>
+          <w:sz w:val="22"/>
+          <w:szCs w:val="22"/>
+        </w:rPr>
+        <w:t xml:space="preserve">Espacio Riesco</w:t>
       </w:r>
     </w:p>
     <w:p>
@@ -112,7 +114,7 @@
           <w:sz w:val="22"/>
           <w:szCs w:val="22"/>
         </w:rPr>
-        <w:t xml:space="preserve">[Dirección]</w:t>
+        <w:t xml:space="preserve">Santiago de Chile</w:t>
       </w:r>
     </w:p>
     <w:p>
@@ -140,7 +142,7 @@
           <w:sz w:val="22"/>
           <w:szCs w:val="22"/>
         </w:rPr>
-        <w:t xml:space="preserve">Solicitud formal de cambio de sala — de Sala Expo Center (4.600 m²) a Gran Salón (1.600 m²) — Cumbre de los Millonarios Conscientes, [fecha del evento].</w:t>
+        <w:t xml:space="preserve">Solicitud formal de cambio de sala — de Sala Expo Center (4.600 m²) a Gran Salón (1.600 m²) — Cumbre de los Millonarios Conscientes, 12 y 13 de septiembre de 2026.</w:t>
       </w:r>
     </w:p>
     <w:p>
@@ -170,7 +172,7 @@
           <w:sz w:val="22"/>
           <w:szCs w:val="22"/>
         </w:rPr>
-        <w:t xml:space="preserve">Por medio de la presente, y en representación de Aura Productions, productora responsable de la Cumbre de los Millonarios Conscientes, a realizarse el [fecha del evento] en sus instalaciones, nos dirigimos a ustedes con el objeto de solicitar formalmente el cambio de la sala oportunamente reservada, pasando de la Sala Expo Center (4.600 m²) al Gran Salón (1.600 m²).</w:t>
+        <w:t xml:space="preserve">Por medio de la presente, y en representación de Aura Productions, productora responsable de la Cumbre de los Millonarios Conscientes, a realizarse los días 12 y 13 de septiembre de 2026 en sus instalaciones, nos dirigimos a ustedes con el objeto de solicitar formalmente el cambio de la sala oportunamente reservada, pasando de la Sala Expo Center (4.600 m²) al Gran Salón (1.600 m²).</w:t>
       </w:r>
     </w:p>
     <w:p>
@@ -365,7 +367,7 @@
           <w:sz w:val="22"/>
           <w:szCs w:val="22"/>
         </w:rPr>
-        <w:t xml:space="preserve">Quedamos a entera disposición para coordinar a la brevedad los aspectos contractuales, la eventual diferencia de tarifas y la readecuación del cronograma de montaje que el cambio requiera.</w:t>
+        <w:t xml:space="preserve">Dada la proximidad de la fecha, quedamos a entera disposición para resolver de manera inmediata los aspectos contractuales, la eventual diferencia de tarifas y la readecuación del cronograma de montaje que el cambio requiera. Agradeceremos su confirmación a la mayor brevedad posible, a fin de dar aviso a nuestros proveedores y no afectar el cronograma de producción.</w:t>
       </w:r>
     </w:p>
     <w:p>

</xml_diff>

<commit_message>
docs: completar bloque de firma de la carta
Firma: Alejandra Millan, Directora de Logistica, con telefono de
contacto. La carta queda sin campos pendientes, lista para enviar.

Co-Authored-By: Claude Opus 5 <noreply@anthropic.com>
Claude-Session: https://claude.ai/code/session_017pezomCG814h6haRSx8NRv
</commit_message>
<xml_diff>
--- a/docs/cartas/carta-cambio-de-sala.docx
+++ b/docs/cartas/carta-cambio-de-sala.docx
@@ -418,7 +418,7 @@
           <w:sz w:val="22"/>
           <w:szCs w:val="22"/>
         </w:rPr>
-        <w:t xml:space="preserve">[Nombre y apellido]</w:t>
+        <w:t xml:space="preserve">Alejandra Millán</w:t>
       </w:r>
     </w:p>
     <w:p>
@@ -433,7 +433,7 @@
           <w:sz w:val="22"/>
           <w:szCs w:val="22"/>
         </w:rPr>
-        <w:t xml:space="preserve">[Cargo] — Aura Productions</w:t>
+        <w:t xml:space="preserve">Directora de Logística — Aura Productions</w:t>
       </w:r>
     </w:p>
     <w:p>
@@ -448,7 +448,7 @@
           <w:sz w:val="19"/>
           <w:szCs w:val="19"/>
         </w:rPr>
-        <w:t xml:space="preserve">hola@auraproductions.com.ar  ·  [Teléfono]</w:t>
+        <w:t xml:space="preserve">hola@auraproductions.com.ar  ·  +57 305 816 1106</w:t>
       </w:r>
     </w:p>
     <w:sectPr>

</xml_diff>